<commit_message>
Preserve rules document content order
</commit_message>
<xml_diff>
--- a/apps/web/public/documents/wz-aerospace-2026-rules.docx
+++ b/apps/web/public/documents/wz-aerospace-2026-rules.docx
@@ -238,21 +238,6 @@
     <w:p>
       <w:pPr>
         <w:spacing w:before="0" w:after="120" w:line="264" w:lineRule="auto"/>
-        <w:ind w:firstLine="446"/>
-        <w:jc w:val="both"/>
-      </w:pPr>
-      <w:r>
-        <w:rPr>
-          <w:rFonts w:ascii="Calibri" w:hAnsi="Calibri" w:eastAsia="宋体"/>
-          <w:b w:val="0"/>
-          <w:sz w:val="22"/>
-        </w:rPr>
-        <w:t>比赛设小学低年级组（1-3年级）、小学中高年级组（4-6年级）和中学组（初中、高中、职高）。</w:t>
-      </w:r>
-    </w:p>
-    <w:p>
-      <w:pPr>
-        <w:spacing w:before="0" w:after="120" w:line="264" w:lineRule="auto"/>
         <w:jc w:val="both"/>
       </w:pPr>
       <w:r>
@@ -318,6 +303,21 @@
           <w:sz w:val="22"/>
         </w:rPr>
         <w:t>（五）多轴无人机足球比赛</w:t>
+      </w:r>
+    </w:p>
+    <w:p>
+      <w:pPr>
+        <w:spacing w:before="0" w:after="120" w:line="264" w:lineRule="auto"/>
+        <w:ind w:firstLine="446"/>
+        <w:jc w:val="both"/>
+      </w:pPr>
+      <w:r>
+        <w:rPr>
+          <w:rFonts w:ascii="Calibri" w:hAnsi="Calibri" w:eastAsia="宋体"/>
+          <w:b w:val="0"/>
+          <w:sz w:val="22"/>
+        </w:rPr>
+        <w:t>比赛设小学低年级组（1-3年级）、小学中高年级组（4-6年级）和中学组（初中、高中、职高）。</w:t>
       </w:r>
     </w:p>
     <w:p>

</xml_diff>